<commit_message>
Rename to NAVRAP, cheetah logo, henry viewer account, single-container hosting
- Application name NAVRAP (AirNav Risk Analysis Platform) in the UI, API,
  reports, demo text and documents; env vars keep the ARAP_ prefix
- New logo: cartoon cheetah with nerd glasses (sidebar, login, favicon)
- Standing viewer account 'henry' created at start-up (bcrypt hash only)
- Root Dockerfile + render.yaml: one container serving API and web app;
  ARAP_STATIC_DIR, $PORT, postgres:// URL normalisation for hosted Postgres
- README: free hosting with Render + Neon; 78 tests pass

Co-Authored-By: Claude Opus 5.5 <noreply@anthropic.com>
Claude-Session: https://claude.ai/code/session_017CRiqdqeXpR5mgFReYz9so
</commit_message>
<xml_diff>
--- a/docs/examples/DEMO-07-investigation-report.docx
+++ b/docs/examples/DEMO-07-investigation-report.docx
@@ -30,7 +30,7 @@
         <w:t xml:space="preserve">Report: </w:t>
       </w:r>
       <w:r>
-        <w:t>ARAP-ORLIO-KNKT.24.10.22.04</w:t>
+        <w:t>NAVRAP-ORLIO-KNKT.24.10.22.04</w:t>
         <w:br/>
       </w:r>
       <w:r>
@@ -60,7 +60,7 @@
         <w:t xml:space="preserve">Prepared by: </w:t>
       </w:r>
       <w:r>
-        <w:t>ARAP worked example — ORLIO analysis using the ATSB method, based on the KNKT final report</w:t>
+        <w:t>NAVRAP worked example — ORLIO analysis using the ATSB method, based on the KNKT final report</w:t>
         <w:br/>
       </w:r>
       <w:r>
@@ -70,7 +70,7 @@
         <w:t xml:space="preserve">Source: </w:t>
       </w:r>
       <w:r>
-        <w:t>KNKT final report KNKT.24.10.22.04 (Komite Nasional Keselamatan Transportasi). Facts are taken from the report; the ORLIO/ATSB analysis, risk ratings and actions marked 'proposed (ARAP example)' are illustrative.</w:t>
+        <w:t>KNKT final report KNKT.24.10.22.04 (Komite Nasional Keselamatan Transportasi). Facts are taken from the report; the ORLIO/ATSB analysis, risk ratings and actions marked 'proposed (NAVRAP example)' are illustrative.</w:t>
         <w:br/>
       </w:r>
       <w:r>
@@ -87,7 +87,7 @@
         <w:rPr>
           <w:i/>
         </w:rPr>
-        <w:t>ARAP inv-report-1.0.0 · analysis engine atsb-1.1.0</w:t>
+        <w:t>NAVRAP inv-report-1.0.0 · analysis engine atsb-1.1.0</w:t>
       </w:r>
     </w:p>
     <w:p>
@@ -2917,7 +2917,7 @@
           </w:tcPr>
           <w:p>
             <w:r>
-              <w:t>not_supported (About as likely as not) — on F1 (Occurrence event): The unattended lavatory service truck moved unaided and struck the tail section of PK-GMP at parking stand W29 — KNKT lists this as a contributing factor ('might have triggered'). Under the ATSB standard of proof (likely, ≥ 66 %) ARAP records it as an other safety factor.</w:t>
+              <w:t>not_supported (About as likely as not) — on F1 (Occurrence event): The unattended lavatory service truck moved unaided and struck the tail section of PK-GMP at parking stand W29 — KNKT lists this as a contributing factor ('might have triggered'). Under the ATSB standard of proof (likely, ≥ 66 %) NAVRAP records it as an other safety factor.</w:t>
             </w:r>
           </w:p>
         </w:tc>
@@ -6582,7 +6582,7 @@
               <w:rPr>
                 <w:sz w:val="17"/>
               </w:rPr>
-              <w:t>[Engineering controls] Use chocks with a high-visibility contact indicator and a 'chocks in contact' call-out confirmed by a second person before leaving the vehicle (proposed (ARAP example); Proposed)</w:t>
+              <w:t>[Engineering controls] Use chocks with a high-visibility contact indicator and a 'chocks in contact' call-out confirmed by a second person before leaving the vehicle (proposed (NAVRAP example); Proposed)</w:t>
             </w:r>
           </w:p>
         </w:tc>
@@ -6984,7 +6984,7 @@
               <w:rPr>
                 <w:sz w:val="17"/>
               </w:rPr>
-              <w:t>[Engineering controls] Mark level GSE parking positions in staging areas and require GSE to park perpendicular to, or facing away from, the aircraft path (proposed (ARAP example); Proposed)</w:t>
+              <w:t>[Engineering controls] Mark level GSE parking positions in staging areas and require GSE to park perpendicular to, or facing away from, the aircraft path (proposed (NAVRAP example); Proposed)</w:t>
             </w:r>
           </w:p>
         </w:tc>
@@ -7051,7 +7051,7 @@
               <w:rPr>
                 <w:sz w:val="17"/>
               </w:rPr>
-              <w:t>[Administrative controls] Keep the staging area beside an arrival stand clear of unattended running GSE from block-in minus 5 minutes until chocks-on (proposed (ARAP example); Proposed)</w:t>
+              <w:t>[Administrative controls] Keep the staging area beside an arrival stand clear of unattended running GSE from block-in minus 5 minutes until chocks-on (proposed (NAVRAP example); Proposed)</w:t>
             </w:r>
           </w:p>
         </w:tc>
@@ -7118,7 +7118,7 @@
               <w:rPr>
                 <w:sz w:val="17"/>
               </w:rPr>
-              <w:t>[Administrative controls] Introduce fatigue risk management for GSE operators: task allocation that avoids one operator covering two stands at the same time late in the shift (proposed (ARAP example); Proposed)</w:t>
+              <w:t>[Administrative controls] Introduce fatigue risk management for GSE operators: task allocation that avoids one operator covering two stands at the same time late in the shift (proposed (NAVRAP example); Proposed)</w:t>
             </w:r>
           </w:p>
         </w:tc>
@@ -7185,7 +7185,7 @@
               <w:rPr>
                 <w:sz w:val="17"/>
               </w:rPr>
-              <w:t>[Administrative controls] Include chock placement (chock in contact with the tyre, front and rear of the wheel) in recurrent GSE operator training with a practical assessment (proposed (ARAP example); Proposed)</w:t>
+              <w:t>[Administrative controls] Include chock placement (chock in contact with the tyre, front and rear of the wheel) in recurrent GSE operator training with a practical assessment (proposed (NAVRAP example); Proposed)</w:t>
             </w:r>
           </w:p>
         </w:tc>
@@ -7252,7 +7252,7 @@
               <w:rPr>
                 <w:sz w:val="17"/>
               </w:rPr>
-              <w:t>[Engineering controls] Repair the LST starting system so the engine can be shut down when the vehicle is left (proposed (ARAP example); Proposed)</w:t>
+              <w:t>[Engineering controls] Repair the LST starting system so the engine can be shut down when the vehicle is left (proposed (NAVRAP example); Proposed)</w:t>
             </w:r>
           </w:p>
         </w:tc>
@@ -7319,7 +7319,7 @@
               <w:rPr>
                 <w:sz w:val="17"/>
               </w:rPr>
-              <w:t>[Elimination] Lock-out/tag-out: any brake defect on the daily check makes the GSE unserviceable and physically tagged, with the key returned to maintenance (proposed (ARAP example); Proposed)</w:t>
+              <w:t>[Elimination] Lock-out/tag-out: any brake defect on the daily check makes the GSE unserviceable and physically tagged, with the key returned to maintenance (proposed (NAVRAP example); Proposed)</w:t>
             </w:r>
           </w:p>
         </w:tc>
@@ -7386,7 +7386,7 @@
               <w:rPr>
                 <w:sz w:val="17"/>
               </w:rPr>
-              <w:t>[Elimination] Prohibit leaving motorized GSE unattended with the engine running in the equipment staging area while an aircraft is arriving at the adjacent stand (proposed (ARAP example); Proposed)</w:t>
+              <w:t>[Elimination] Prohibit leaving motorized GSE unattended with the engine running in the equipment staging area while an aircraft is arriving at the adjacent stand (proposed (NAVRAP example); Proposed)</w:t>
             </w:r>
           </w:p>
         </w:tc>
@@ -7453,7 +7453,7 @@
               <w:rPr>
                 <w:sz w:val="17"/>
               </w:rPr>
-              <w:t>[Engineering controls] Reinstall parking brake shoes and linings and remove the LST from service until the parking brake passes a holding test (proposed (ARAP example); Proposed)</w:t>
+              <w:t>[Engineering controls] Reinstall parking brake shoes and linings and remove the LST from service until the parking brake passes a holding test (proposed (NAVRAP example); Proposed)</w:t>
             </w:r>
           </w:p>
         </w:tc>

</xml_diff>